<commit_message>
Entrega tp_1 pdf, y actualizacion del informe
</commit_message>
<xml_diff>
--- a/tp1/Informe.docx
+++ b/tp1/Informe.docx
@@ -1,33 +1,7 @@
 
 <file path=word/document.xml><?xml version="1.0" encoding="utf-8"?>
-<w:document xmlns:wpc="http://schemas.microsoft.com/office/word/2010/wordprocessingCanvas" xmlns:cx="http://schemas.microsoft.com/office/drawing/2014/chartex" xmlns:mc="http://schemas.openxmlformats.org/markup-compatibility/2006" xmlns:o="urn:schemas-microsoft-com:office:office" xmlns:r="http://schemas.openxmlformats.org/officeDocument/2006/relationships" xmlns:m="http://schemas.openxmlformats.org/officeDocument/2006/math" xmlns:v="urn:schemas-microsoft-com:vml" xmlns:wp14="http://schemas.microsoft.com/office/word/2010/wordprocessingDrawing" xmlns:wp="http://schemas.openxmlformats.org/drawingml/2006/wordprocessingDrawing" xmlns:w10="urn:schemas-microsoft-com:office:word" xmlns:w="http://schemas.openxmlformats.org/wordprocessingml/2006/main" xmlns:w14="http://schemas.microsoft.com/office/word/2010/wordml" xmlns:w15="http://schemas.microsoft.com/office/word/2012/wordml" xmlns:w16se="http://schemas.microsoft.com/office/word/2015/wordml/symex" xmlns:wpg="http://schemas.microsoft.com/office/word/2010/wordprocessingGroup" xmlns:wpi="http://schemas.microsoft.com/office/word/2010/wordprocessingInk" xmlns:wne="http://schemas.microsoft.com/office/word/2006/wordml" xmlns:wps="http://schemas.microsoft.com/office/word/2010/wordprocessingShape" mc:Ignorable="w14 w15 w16se wp14">
+<w:document xmlns:wpc="http://schemas.microsoft.com/office/word/2010/wordprocessingCanvas" xmlns:cx="http://schemas.microsoft.com/office/drawing/2014/chartex" xmlns:cx1="http://schemas.microsoft.com/office/drawing/2015/9/8/chartex" xmlns:cx2="http://schemas.microsoft.com/office/drawing/2015/10/21/chartex" xmlns:cx3="http://schemas.microsoft.com/office/drawing/2016/5/9/chartex" xmlns:cx4="http://schemas.microsoft.com/office/drawing/2016/5/10/chartex" xmlns:cx5="http://schemas.microsoft.com/office/drawing/2016/5/11/chartex" xmlns:cx6="http://schemas.microsoft.com/office/drawing/2016/5/12/chartex" xmlns:cx7="http://schemas.microsoft.com/office/drawing/2016/5/13/chartex" xmlns:cx8="http://schemas.microsoft.com/office/drawing/2016/5/14/chartex" xmlns:mc="http://schemas.openxmlformats.org/markup-compatibility/2006" xmlns:aink="http://schemas.microsoft.com/office/drawing/2016/ink" xmlns:am3d="http://schemas.microsoft.com/office/drawing/2017/model3d" xmlns:o="urn:schemas-microsoft-com:office:office" xmlns:oel="http://schemas.microsoft.com/office/2019/extlst" xmlns:r="http://schemas.openxmlformats.org/officeDocument/2006/relationships" xmlns:m="http://schemas.openxmlformats.org/officeDocument/2006/math" xmlns:v="urn:schemas-microsoft-com:vml" xmlns:wp14="http://schemas.microsoft.com/office/word/2010/wordprocessingDrawing" xmlns:wp="http://schemas.openxmlformats.org/drawingml/2006/wordprocessingDrawing" xmlns:w10="urn:schemas-microsoft-com:office:word" xmlns:w="http://schemas.openxmlformats.org/wordprocessingml/2006/main" xmlns:w14="http://schemas.microsoft.com/office/word/2010/wordml" xmlns:w15="http://schemas.microsoft.com/office/word/2012/wordml" xmlns:w16cex="http://schemas.microsoft.com/office/word/2018/wordml/cex" xmlns:w16cid="http://schemas.microsoft.com/office/word/2016/wordml/cid" xmlns:w16="http://schemas.microsoft.com/office/word/2018/wordml" xmlns:w16du="http://schemas.microsoft.com/office/word/2023/wordml/word16du" xmlns:w16sdtdh="http://schemas.microsoft.com/office/word/2020/wordml/sdtdatahash" xmlns:w16sdtfl="http://schemas.microsoft.com/office/word/2024/wordml/sdtformatlock" xmlns:w16se="http://schemas.microsoft.com/office/word/2015/wordml/symex" xmlns:wpg="http://schemas.microsoft.com/office/word/2010/wordprocessingGroup" xmlns:wpi="http://schemas.microsoft.com/office/word/2010/wordprocessingInk" xmlns:wne="http://schemas.microsoft.com/office/word/2006/wordml" xmlns:wps="http://schemas.microsoft.com/office/word/2010/wordprocessingShape" mc:Ignorable="w14 w15 w16se w16cid w16 w16cex w16sdtdh w16sdtfl w16du wp14">
   <w:body>
-    <w:p>
-      <w:pPr>
-        <w:pStyle w:val="Ttulo"/>
-        <w:pBdr>
-          <w:top w:val="nil"/>
-          <w:left w:val="nil"/>
-          <w:bottom w:val="nil"/>
-          <w:right w:val="nil"/>
-          <w:between w:val="nil"/>
-        </w:pBdr>
-        <w:rPr>
-          <w:color w:val="1C4587"/>
-        </w:rPr>
-      </w:pPr>
-      <w:bookmarkStart w:id="0" w:name="_nj23sjpj5u97" w:colFirst="0" w:colLast="0"/>
-      <w:bookmarkEnd w:id="0"/>
-      <w:r>
-        <w:rPr>
-          <w:rFonts w:ascii="Cambria" w:eastAsia="Cambria" w:hAnsi="Cambria" w:cs="Cambria"/>
-          <w:i/>
-          <w:iCs/>
-          <w:color w:val="1C4587"/>
-        </w:rPr>
-        <w:t xml:space="preserve">Insuficiencia del Sueño </w:t>
-      </w:r>
-    </w:p>
     <w:p>
       <w:pPr>
         <w:pStyle w:val="Subttulo"/>
@@ -38,16 +12,64 @@
           <w:right w:val="nil"/>
           <w:between w:val="nil"/>
         </w:pBdr>
-      </w:pPr>
-      <w:bookmarkStart w:id="1" w:name="_dw2dac9r7xzm" w:colFirst="0" w:colLast="0"/>
-      <w:bookmarkEnd w:id="1"/>
+        <w:jc w:val="left"/>
+        <w:rPr>
+          <w:rFonts w:ascii="Cambria" w:eastAsia="Cambria" w:hAnsi="Cambria" w:cs="Cambria"/>
+          <w:b/>
+          <w:bCs/>
+          <w:color w:val="1C4587"/>
+          <w:sz w:val="40"/>
+          <w:szCs w:val="40"/>
+        </w:rPr>
+      </w:pPr>
+      <w:bookmarkStart w:id="0" w:name="_dw2dac9r7xzm" w:colFirst="0" w:colLast="0"/>
+      <w:bookmarkEnd w:id="0"/>
+      <w:r>
+        <w:rPr>
+          <w:rFonts w:ascii="Cambria" w:eastAsia="Cambria" w:hAnsi="Cambria" w:cs="Cambria"/>
+          <w:b/>
+          <w:bCs/>
+          <w:color w:val="1C4587"/>
+          <w:sz w:val="40"/>
+          <w:szCs w:val="40"/>
+        </w:rPr>
+        <w:t>Consumo Digital en Adolescentes</w:t>
+      </w:r>
     </w:p>
     <w:p>
       <w:pPr>
+        <w:pStyle w:val="Subttulo"/>
+        <w:pBdr>
+          <w:top w:val="nil"/>
+          <w:left w:val="nil"/>
+          <w:bottom w:val="nil"/>
+          <w:right w:val="nil"/>
+          <w:between w:val="nil"/>
+        </w:pBdr>
+        <w:jc w:val="left"/>
+        <w:rPr>
+          <w:rFonts w:ascii="Cambria" w:eastAsia="Cambria" w:hAnsi="Cambria" w:cs="Cambria"/>
+          <w:color w:val="1C4587"/>
+          <w:sz w:val="28"/>
+          <w:szCs w:val="28"/>
+        </w:rPr>
+      </w:pPr>
+      <w:r>
+        <w:rPr>
+          <w:rFonts w:ascii="Cambria" w:eastAsia="Cambria" w:hAnsi="Cambria" w:cs="Cambria"/>
+          <w:color w:val="1C4587"/>
+          <w:sz w:val="28"/>
+          <w:szCs w:val="28"/>
+        </w:rPr>
+        <w:t>Segmentación y caracterización de perfiles mediante Aprendizaje No Supervisado</w:t>
+      </w:r>
+    </w:p>
+    <w:p>
+      <w:pPr>
         <w:pStyle w:val="Ttulo"/>
       </w:pPr>
-      <w:bookmarkStart w:id="2" w:name="_54aqzjygpvb2" w:colFirst="0" w:colLast="0"/>
-      <w:bookmarkEnd w:id="2"/>
+      <w:bookmarkStart w:id="1" w:name="_54aqzjygpvb2" w:colFirst="0" w:colLast="0"/>
+      <w:bookmarkEnd w:id="1"/>
       <w:r>
         <w:rPr>
           <w:noProof/>
@@ -366,45 +388,8 @@
           <w:sz w:val="20"/>
           <w:szCs w:val="20"/>
         </w:rPr>
-        <w:t xml:space="preserve"> </w:t>
-      </w:r>
-      <w:proofErr w:type="spellStart"/>
-      <w:r>
-        <w:rPr>
-          <w:rFonts w:ascii="Cambria" w:eastAsia="Cambria" w:hAnsi="Cambria" w:cs="Cambria"/>
-          <w:i/>
-          <w:iCs/>
-          <w:color w:val="1C4587"/>
-          <w:sz w:val="20"/>
-          <w:szCs w:val="20"/>
-        </w:rPr>
-        <w:t>Nardin</w:t>
-      </w:r>
-      <w:proofErr w:type="spellEnd"/>
-      <w:r>
-        <w:rPr>
-          <w:rFonts w:ascii="Cambria" w:eastAsia="Cambria" w:hAnsi="Cambria" w:cs="Cambria"/>
-          <w:i/>
-          <w:iCs/>
-          <w:color w:val="1C4587"/>
-          <w:sz w:val="20"/>
-          <w:szCs w:val="20"/>
-        </w:rPr>
-        <w:t xml:space="preserve">, Luján </w:t>
-      </w:r>
-      <w:proofErr w:type="spellStart"/>
-      <w:r>
-        <w:rPr>
-          <w:rFonts w:ascii="Cambria" w:eastAsia="Cambria" w:hAnsi="Cambria" w:cs="Cambria"/>
-          <w:i/>
-          <w:iCs/>
-          <w:color w:val="1C4587"/>
-          <w:sz w:val="20"/>
-          <w:szCs w:val="20"/>
-        </w:rPr>
-        <w:t>Cazenabe</w:t>
-      </w:r>
-      <w:proofErr w:type="spellEnd"/>
+        <w:t xml:space="preserve"> Nardin, Luján Cazenabe</w:t>
+      </w:r>
       <w:r>
         <w:rPr>
           <w:color w:val="783F04"/>
@@ -441,8 +426,8 @@
           <w:between w:val="nil"/>
         </w:pBdr>
       </w:pPr>
-      <w:bookmarkStart w:id="3" w:name="_mnsct9bkmwtq" w:colFirst="0" w:colLast="0"/>
-      <w:bookmarkEnd w:id="3"/>
+      <w:bookmarkStart w:id="2" w:name="_mnsct9bkmwtq" w:colFirst="0" w:colLast="0"/>
+      <w:bookmarkEnd w:id="2"/>
       <w:r>
         <w:lastRenderedPageBreak/>
         <w:t xml:space="preserve">Descripción del contexto y del problema </w:t>
@@ -475,15 +460,7 @@
         <w:jc w:val="both"/>
       </w:pPr>
       <w:r>
-        <w:t xml:space="preserve">El uso de dispositivos electrónicos, redes sociales, videojuegos y servicios de televisión o </w:t>
-      </w:r>
-      <w:proofErr w:type="spellStart"/>
-      <w:r>
-        <w:t>streaming</w:t>
-      </w:r>
-      <w:proofErr w:type="spellEnd"/>
-      <w:r>
-        <w:t xml:space="preserve"> forma parte de la vida cotidiana de los adolescentes. Sin embargo, el comportamiento digital no necesariamente es homogéneo: dos adolescentes pueden presentar una cantidad similar de horas de exposición a pantallas y, aun así, distribuir ese tiempo de manera muy diferente entre redes sociales, videojuegos, juegos en dispositivos móviles, contenido audiovisual u otras actividades.</w:t>
+        <w:t>El uso de dispositivos electrónicos, redes sociales, videojuegos y servicios de televisión o streaming forma parte de la vida cotidiana de los adolescentes. Sin embargo, el comportamiento digital no necesariamente es homogéneo: dos adolescentes pueden presentar una cantidad similar de horas de exposición a pantallas y, aun así, distribuir ese tiempo de manera muy diferente entre redes sociales, videojuegos, juegos en dispositivos móviles, contenido audiovisual u otras actividades.</w:t>
       </w:r>
     </w:p>
     <w:p>
@@ -597,8 +574,8 @@
           <w:between w:val="nil"/>
         </w:pBdr>
       </w:pPr>
-      <w:bookmarkStart w:id="4" w:name="_75rf4vta81ax" w:colFirst="0" w:colLast="0"/>
-      <w:bookmarkEnd w:id="4"/>
+      <w:bookmarkStart w:id="3" w:name="_75rf4vta81ax" w:colFirst="0" w:colLast="0"/>
+      <w:bookmarkEnd w:id="3"/>
     </w:p>
     <w:p>
       <w:pPr>
@@ -1030,290 +1007,206 @@
         </w:rPr>
         <w:t xml:space="preserve"> </w:t>
       </w:r>
-      <w:proofErr w:type="spellStart"/>
       <w:r>
         <w:rPr>
           <w:b/>
           <w:bCs/>
           <w:lang w:val="es-AR"/>
         </w:rPr>
-        <w:t>Screen</w:t>
-      </w:r>
-      <w:proofErr w:type="spellEnd"/>
+        <w:t xml:space="preserve">Screen use, </w:t>
+      </w:r>
+      <w:proofErr w:type="spellStart"/>
       <w:r>
         <w:rPr>
           <w:b/>
           <w:bCs/>
           <w:lang w:val="es-AR"/>
         </w:rPr>
-        <w:t xml:space="preserve"> use, </w:t>
-      </w:r>
-      <w:proofErr w:type="spellStart"/>
+        <w:t>sleep</w:t>
+      </w:r>
+      <w:proofErr w:type="spellEnd"/>
       <w:r>
         <w:rPr>
           <w:b/>
           <w:bCs/>
           <w:lang w:val="es-AR"/>
         </w:rPr>
-        <w:t>sleep</w:t>
-      </w:r>
-      <w:proofErr w:type="spellEnd"/>
+        <w:t xml:space="preserve"> </w:t>
+      </w:r>
+      <w:proofErr w:type="spellStart"/>
       <w:r>
         <w:rPr>
           <w:b/>
           <w:bCs/>
           <w:lang w:val="es-AR"/>
         </w:rPr>
-        <w:t xml:space="preserve"> </w:t>
-      </w:r>
-      <w:proofErr w:type="spellStart"/>
+        <w:t>duration</w:t>
+      </w:r>
+      <w:proofErr w:type="spellEnd"/>
       <w:r>
         <w:rPr>
           <w:b/>
           <w:bCs/>
           <w:lang w:val="es-AR"/>
         </w:rPr>
-        <w:t>duration</w:t>
-      </w:r>
-      <w:proofErr w:type="spellEnd"/>
+        <w:t xml:space="preserve">, </w:t>
+      </w:r>
+      <w:proofErr w:type="spellStart"/>
       <w:r>
         <w:rPr>
           <w:b/>
           <w:bCs/>
           <w:lang w:val="es-AR"/>
         </w:rPr>
-        <w:t xml:space="preserve">, </w:t>
-      </w:r>
-      <w:proofErr w:type="spellStart"/>
+        <w:t>daytime</w:t>
+      </w:r>
+      <w:proofErr w:type="spellEnd"/>
       <w:r>
         <w:rPr>
           <w:b/>
           <w:bCs/>
           <w:lang w:val="es-AR"/>
         </w:rPr>
-        <w:t>daytime</w:t>
-      </w:r>
-      <w:proofErr w:type="spellEnd"/>
+        <w:t xml:space="preserve"> </w:t>
+      </w:r>
+      <w:proofErr w:type="spellStart"/>
       <w:r>
         <w:rPr>
           <w:b/>
           <w:bCs/>
           <w:lang w:val="es-AR"/>
         </w:rPr>
-        <w:t xml:space="preserve"> </w:t>
-      </w:r>
-      <w:proofErr w:type="spellStart"/>
+        <w:t>somnolence</w:t>
+      </w:r>
+      <w:proofErr w:type="spellEnd"/>
       <w:r>
         <w:rPr>
           <w:b/>
           <w:bCs/>
           <w:lang w:val="es-AR"/>
         </w:rPr>
-        <w:t>somnolence</w:t>
-      </w:r>
-      <w:proofErr w:type="spellEnd"/>
+        <w:t xml:space="preserve">, and </w:t>
+      </w:r>
+      <w:proofErr w:type="spellStart"/>
       <w:r>
         <w:rPr>
           <w:b/>
           <w:bCs/>
           <w:lang w:val="es-AR"/>
         </w:rPr>
-        <w:t xml:space="preserve">, and </w:t>
-      </w:r>
-      <w:proofErr w:type="spellStart"/>
+        <w:t>academic</w:t>
+      </w:r>
+      <w:proofErr w:type="spellEnd"/>
       <w:r>
         <w:rPr>
           <w:b/>
           <w:bCs/>
           <w:lang w:val="es-AR"/>
         </w:rPr>
-        <w:t>academic</w:t>
-      </w:r>
-      <w:proofErr w:type="spellEnd"/>
+        <w:t xml:space="preserve"> </w:t>
+      </w:r>
+      <w:proofErr w:type="spellStart"/>
       <w:r>
         <w:rPr>
           <w:b/>
           <w:bCs/>
           <w:lang w:val="es-AR"/>
         </w:rPr>
-        <w:t xml:space="preserve"> </w:t>
-      </w:r>
-      <w:proofErr w:type="spellStart"/>
+        <w:t>failure</w:t>
+      </w:r>
+      <w:proofErr w:type="spellEnd"/>
       <w:r>
         <w:rPr>
           <w:b/>
           <w:bCs/>
           <w:lang w:val="es-AR"/>
         </w:rPr>
-        <w:t>failure</w:t>
-      </w:r>
-      <w:proofErr w:type="spellEnd"/>
+        <w:t xml:space="preserve"> in </w:t>
+      </w:r>
+      <w:proofErr w:type="spellStart"/>
       <w:r>
         <w:rPr>
           <w:b/>
           <w:bCs/>
           <w:lang w:val="es-AR"/>
         </w:rPr>
-        <w:t xml:space="preserve"> in </w:t>
-      </w:r>
-      <w:proofErr w:type="spellStart"/>
+        <w:t>school-aged</w:t>
+      </w:r>
+      <w:proofErr w:type="spellEnd"/>
       <w:r>
         <w:rPr>
           <w:b/>
           <w:bCs/>
           <w:lang w:val="es-AR"/>
         </w:rPr>
-        <w:t>school-aged</w:t>
-      </w:r>
-      <w:proofErr w:type="spellEnd"/>
+        <w:t xml:space="preserve"> </w:t>
+      </w:r>
+      <w:proofErr w:type="spellStart"/>
       <w:r>
         <w:rPr>
           <w:b/>
           <w:bCs/>
           <w:lang w:val="es-AR"/>
         </w:rPr>
+        <w:t>adolescents</w:t>
+      </w:r>
+      <w:proofErr w:type="spellEnd"/>
+    </w:p>
+    <w:p>
+      <w:pPr>
+        <w:spacing w:before="240" w:after="240"/>
+      </w:pPr>
+      <w:r>
+        <w:rPr>
+          <w:lang w:val="es-AR"/>
+        </w:rPr>
+        <w:t>Los autores son</w:t>
+      </w:r>
+      <w:r>
+        <w:rPr>
+          <w:lang w:val="es-AR"/>
+        </w:rPr>
         <w:t xml:space="preserve"> </w:t>
       </w:r>
-      <w:proofErr w:type="spellStart"/>
       <w:r>
         <w:rPr>
           <w:b/>
           <w:bCs/>
           <w:lang w:val="es-AR"/>
         </w:rPr>
-        <w:t>adolescents</w:t>
-      </w:r>
-      <w:proofErr w:type="spellEnd"/>
-    </w:p>
-    <w:p>
-      <w:pPr>
-        <w:spacing w:before="240" w:after="240"/>
-      </w:pPr>
-      <w:r>
-        <w:rPr>
-          <w:lang w:val="es-AR"/>
-        </w:rPr>
-        <w:t>Los autores son</w:t>
-      </w:r>
-      <w:r>
-        <w:rPr>
-          <w:lang w:val="es-AR"/>
-        </w:rPr>
-        <w:t xml:space="preserve"> </w:t>
-      </w:r>
+        <w:t xml:space="preserve">Daniel Pérez-Chada, Sergio Arias Bioch, Daniel Schönfeld, David Gozal y Santiago </w:t>
+      </w:r>
+      <w:proofErr w:type="spellStart"/>
       <w:r>
         <w:rPr>
           <w:b/>
           <w:bCs/>
           <w:lang w:val="es-AR"/>
         </w:rPr>
-        <w:t>Daniel Pérez-</w:t>
-      </w:r>
-      <w:proofErr w:type="spellStart"/>
+        <w:t>Perez</w:t>
+      </w:r>
+      <w:proofErr w:type="spellEnd"/>
       <w:r>
         <w:rPr>
           <w:b/>
           <w:bCs/>
           <w:lang w:val="es-AR"/>
         </w:rPr>
-        <w:t>Chada</w:t>
-      </w:r>
-      <w:proofErr w:type="spellEnd"/>
-      <w:r>
-        <w:rPr>
-          <w:b/>
-          <w:bCs/>
+        <w:t>-Lloret</w:t>
+      </w:r>
+      <w:r>
+        <w:rPr>
           <w:lang w:val="es-AR"/>
         </w:rPr>
-        <w:t xml:space="preserve">, Sergio Arias </w:t>
-      </w:r>
-      <w:proofErr w:type="spellStart"/>
-      <w:r>
-        <w:rPr>
-          <w:b/>
-          <w:bCs/>
-          <w:lang w:val="es-AR"/>
-        </w:rPr>
-        <w:t>Bioch</w:t>
-      </w:r>
-      <w:proofErr w:type="spellEnd"/>
-      <w:r>
-        <w:rPr>
-          <w:b/>
-          <w:bCs/>
-          <w:lang w:val="es-AR"/>
-        </w:rPr>
-        <w:t xml:space="preserve">, Daniel </w:t>
-      </w:r>
-      <w:proofErr w:type="spellStart"/>
-      <w:r>
-        <w:rPr>
-          <w:b/>
-          <w:bCs/>
-          <w:lang w:val="es-AR"/>
-        </w:rPr>
-        <w:t>Schönfeld</w:t>
-      </w:r>
-      <w:proofErr w:type="spellEnd"/>
-      <w:r>
-        <w:rPr>
-          <w:b/>
-          <w:bCs/>
-          <w:lang w:val="es-AR"/>
-        </w:rPr>
-        <w:t xml:space="preserve">, David </w:t>
-      </w:r>
-      <w:proofErr w:type="spellStart"/>
-      <w:r>
-        <w:rPr>
-          <w:b/>
-          <w:bCs/>
-          <w:lang w:val="es-AR"/>
-        </w:rPr>
-        <w:t>Gozal</w:t>
-      </w:r>
-      <w:proofErr w:type="spellEnd"/>
-      <w:r>
-        <w:rPr>
-          <w:b/>
-          <w:bCs/>
-          <w:lang w:val="es-AR"/>
-        </w:rPr>
-        <w:t xml:space="preserve"> y Santiago </w:t>
-      </w:r>
-      <w:proofErr w:type="spellStart"/>
-      <w:r>
-        <w:rPr>
-          <w:b/>
-          <w:bCs/>
-          <w:lang w:val="es-AR"/>
-        </w:rPr>
-        <w:t>Perez-Lloret</w:t>
-      </w:r>
-      <w:proofErr w:type="spellEnd"/>
-      <w:r>
-        <w:rPr>
-          <w:lang w:val="es-AR"/>
-        </w:rPr>
         <w:t xml:space="preserve">, entre otros integrantes del </w:t>
       </w:r>
-      <w:proofErr w:type="spellStart"/>
       <w:r>
         <w:rPr>
           <w:i/>
           <w:iCs/>
           <w:lang w:val="es-AR"/>
         </w:rPr>
-        <w:t>Sleep</w:t>
-      </w:r>
-      <w:proofErr w:type="spellEnd"/>
-      <w:r>
-        <w:rPr>
-          <w:i/>
-          <w:iCs/>
-          <w:lang w:val="es-AR"/>
-        </w:rPr>
-        <w:t xml:space="preserve"> in </w:t>
+        <w:t xml:space="preserve">Sleep in </w:t>
       </w:r>
       <w:proofErr w:type="spellStart"/>
       <w:r>
@@ -1483,8 +1376,8 @@
           <w:between w:val="nil"/>
         </w:pBdr>
       </w:pPr>
-      <w:bookmarkStart w:id="5" w:name="_kn5uvgo00ajj" w:colFirst="0" w:colLast="0"/>
-      <w:bookmarkEnd w:id="5"/>
+      <w:bookmarkStart w:id="4" w:name="_kn5uvgo00ajj" w:colFirst="0" w:colLast="0"/>
+      <w:bookmarkEnd w:id="4"/>
       <w:r>
         <w:t xml:space="preserve">Características del </w:t>
       </w:r>
@@ -1690,8 +1583,8 @@
         </w:pBdr>
         <w:spacing w:after="200"/>
       </w:pPr>
-      <w:bookmarkStart w:id="6" w:name="_o8rmzovhszmh" w:colFirst="0" w:colLast="0"/>
-      <w:bookmarkEnd w:id="6"/>
+      <w:bookmarkStart w:id="5" w:name="_o8rmzovhszmh" w:colFirst="0" w:colLast="0"/>
+      <w:bookmarkEnd w:id="5"/>
     </w:p>
     <w:p>
       <w:pPr>
@@ -1792,8 +1685,8 @@
           <w:between w:val="nil"/>
         </w:pBdr>
       </w:pPr>
-      <w:bookmarkStart w:id="7" w:name="_chou9188p6co" w:colFirst="0" w:colLast="0"/>
-      <w:bookmarkEnd w:id="7"/>
+      <w:bookmarkStart w:id="6" w:name="_chou9188p6co" w:colFirst="0" w:colLast="0"/>
+      <w:bookmarkEnd w:id="6"/>
       <w:r>
         <w:t xml:space="preserve">Semántica de las variables </w:t>
       </w:r>
@@ -8226,15 +8119,15 @@
           </w:tcPr>
           <w:p>
             <w:r>
-              <w:t>Puntaje Z de peso para la edad (</w:t>
+              <w:t>Puntaje Z de peso para la edad (Weight-</w:t>
             </w:r>
             <w:proofErr w:type="spellStart"/>
             <w:r>
-              <w:t>Weight-for-Age</w:t>
+              <w:t>for</w:t>
             </w:r>
             <w:proofErr w:type="spellEnd"/>
             <w:r>
-              <w:t xml:space="preserve"> Z-score).</w:t>
+              <w:t>-Age Z-score).</w:t>
             </w:r>
           </w:p>
         </w:tc>
@@ -8288,15 +8181,15 @@
           </w:tcPr>
           <w:p>
             <w:r>
-              <w:t>Puntaje Z de talla/altura para la edad (</w:t>
+              <w:t>Puntaje Z de talla/altura para la edad (Height-</w:t>
             </w:r>
             <w:proofErr w:type="spellStart"/>
             <w:r>
-              <w:t>Height-for-Age</w:t>
+              <w:t>for</w:t>
             </w:r>
             <w:proofErr w:type="spellEnd"/>
             <w:r>
-              <w:t xml:space="preserve"> Z-score).</w:t>
+              <w:t>-Age Z-score).</w:t>
             </w:r>
           </w:p>
         </w:tc>
@@ -8360,15 +8253,7 @@
             </w:r>
             <w:proofErr w:type="spellEnd"/>
             <w:r>
-              <w:t>-</w:t>
-            </w:r>
-            <w:proofErr w:type="spellStart"/>
-            <w:r>
-              <w:t>Age</w:t>
-            </w:r>
-            <w:proofErr w:type="spellEnd"/>
-            <w:r>
-              <w:t xml:space="preserve"> Z-score).</w:t>
+              <w:t>-Age Z-score).</w:t>
             </w:r>
           </w:p>
         </w:tc>
@@ -9075,10 +8960,10 @@
           <w:between w:val="nil"/>
         </w:pBdr>
       </w:pPr>
-      <w:bookmarkStart w:id="8" w:name="_9erzzv7symc" w:colFirst="0" w:colLast="0"/>
-      <w:bookmarkStart w:id="9" w:name="_upsdn5xevax7" w:colFirst="0" w:colLast="0"/>
+      <w:bookmarkStart w:id="7" w:name="_9erzzv7symc" w:colFirst="0" w:colLast="0"/>
+      <w:bookmarkStart w:id="8" w:name="_upsdn5xevax7" w:colFirst="0" w:colLast="0"/>
+      <w:bookmarkEnd w:id="7"/>
       <w:bookmarkEnd w:id="8"/>
-      <w:bookmarkEnd w:id="9"/>
     </w:p>
     <w:p>
       <w:pPr>
@@ -9129,15 +9014,7 @@
       </w:pPr>
       <w:r>
         <w:lastRenderedPageBreak/>
-        <w:t xml:space="preserve">Propuesta de </w:t>
-      </w:r>
-      <w:proofErr w:type="spellStart"/>
-      <w:r>
-        <w:t>preprocesamiento</w:t>
-      </w:r>
-      <w:proofErr w:type="spellEnd"/>
-      <w:r>
-        <w:t xml:space="preserve"> y limpieza </w:t>
+        <w:t xml:space="preserve">Propuesta de preprocesamiento y limpieza </w:t>
       </w:r>
     </w:p>
     <w:p>
@@ -9528,7 +9405,7 @@
         </w:pBdr>
         <w:spacing w:before="0"/>
         <w:rPr>
-          <w:rStyle w:val="Textoennegrita"/>
+          <w:rStyle w:val="Fuerte"/>
         </w:rPr>
       </w:pPr>
     </w:p>
@@ -9543,18 +9420,18 @@
         </w:pBdr>
         <w:spacing w:before="0"/>
         <w:rPr>
-          <w:rStyle w:val="Textoennegrita"/>
-        </w:rPr>
-      </w:pPr>
-      <w:r>
-        <w:rPr>
-          <w:rStyle w:val="Textoennegrita"/>
+          <w:rStyle w:val="Fuerte"/>
+        </w:rPr>
+      </w:pPr>
+      <w:r>
+        <w:rPr>
+          <w:rStyle w:val="Fuerte"/>
         </w:rPr>
         <w:t>6.</w:t>
       </w:r>
       <w:r>
         <w:rPr>
-          <w:rStyle w:val="Textoennegrita"/>
+          <w:rStyle w:val="Fuerte"/>
         </w:rPr>
         <w:t>Preparación de conjuntos experimentales</w:t>
       </w:r>
@@ -9592,7 +9469,7 @@
         </w:pBdr>
         <w:spacing w:before="0"/>
         <w:rPr>
-          <w:rStyle w:val="Textoennegrita"/>
+          <w:rStyle w:val="Fuerte"/>
         </w:rPr>
       </w:pPr>
     </w:p>
@@ -9607,7 +9484,7 @@
         </w:pBdr>
         <w:spacing w:before="0"/>
         <w:rPr>
-          <w:rStyle w:val="Textoennegrita"/>
+          <w:rStyle w:val="Fuerte"/>
         </w:rPr>
       </w:pPr>
     </w:p>
@@ -9622,7 +9499,7 @@
         </w:pBdr>
         <w:spacing w:before="0"/>
         <w:rPr>
-          <w:rStyle w:val="Textoennegrita"/>
+          <w:rStyle w:val="Fuerte"/>
         </w:rPr>
       </w:pPr>
     </w:p>
@@ -9637,7 +9514,7 @@
         </w:pBdr>
         <w:spacing w:before="0"/>
         <w:rPr>
-          <w:rStyle w:val="Textoennegrita"/>
+          <w:rStyle w:val="Fuerte"/>
         </w:rPr>
       </w:pPr>
     </w:p>
@@ -9652,14 +9529,12 @@
         </w:pBdr>
         <w:spacing w:before="0"/>
         <w:rPr>
-          <w:rStyle w:val="Textoennegrita"/>
-        </w:rPr>
-      </w:pPr>
-      <w:bookmarkStart w:id="10" w:name="_GoBack"/>
-      <w:bookmarkEnd w:id="10"/>
-      <w:r>
-        <w:rPr>
-          <w:rStyle w:val="Textoennegrita"/>
+          <w:rStyle w:val="Fuerte"/>
+        </w:rPr>
+      </w:pPr>
+      <w:r>
+        <w:rPr>
+          <w:rStyle w:val="Fuerte"/>
         </w:rPr>
         <w:lastRenderedPageBreak/>
         <w:t>Flujo general de trabajo:</w:t>
@@ -9819,7 +9694,7 @@
 </file>
 
 <file path=word/endnotes.xml><?xml version="1.0" encoding="utf-8"?>
-<w:endnotes xmlns:wpc="http://schemas.microsoft.com/office/word/2010/wordprocessingCanvas" xmlns:cx="http://schemas.microsoft.com/office/drawing/2014/chartex" xmlns:mc="http://schemas.openxmlformats.org/markup-compatibility/2006" xmlns:o="urn:schemas-microsoft-com:office:office" xmlns:r="http://schemas.openxmlformats.org/officeDocument/2006/relationships" xmlns:m="http://schemas.openxmlformats.org/officeDocument/2006/math" xmlns:v="urn:schemas-microsoft-com:vml" xmlns:wp14="http://schemas.microsoft.com/office/word/2010/wordprocessingDrawing" xmlns:wp="http://schemas.openxmlformats.org/drawingml/2006/wordprocessingDrawing" xmlns:w10="urn:schemas-microsoft-com:office:word" xmlns:w="http://schemas.openxmlformats.org/wordprocessingml/2006/main" xmlns:w14="http://schemas.microsoft.com/office/word/2010/wordml" xmlns:w15="http://schemas.microsoft.com/office/word/2012/wordml" xmlns:w16se="http://schemas.microsoft.com/office/word/2015/wordml/symex" xmlns:wpg="http://schemas.microsoft.com/office/word/2010/wordprocessingGroup" xmlns:wpi="http://schemas.microsoft.com/office/word/2010/wordprocessingInk" xmlns:wne="http://schemas.microsoft.com/office/word/2006/wordml" xmlns:wps="http://schemas.microsoft.com/office/word/2010/wordprocessingShape" mc:Ignorable="w14 w15 w16se wp14">
+<w:endnotes xmlns:wpc="http://schemas.microsoft.com/office/word/2010/wordprocessingCanvas" xmlns:cx="http://schemas.microsoft.com/office/drawing/2014/chartex" xmlns:cx1="http://schemas.microsoft.com/office/drawing/2015/9/8/chartex" xmlns:cx2="http://schemas.microsoft.com/office/drawing/2015/10/21/chartex" xmlns:cx3="http://schemas.microsoft.com/office/drawing/2016/5/9/chartex" xmlns:cx4="http://schemas.microsoft.com/office/drawing/2016/5/10/chartex" xmlns:cx5="http://schemas.microsoft.com/office/drawing/2016/5/11/chartex" xmlns:cx6="http://schemas.microsoft.com/office/drawing/2016/5/12/chartex" xmlns:cx7="http://schemas.microsoft.com/office/drawing/2016/5/13/chartex" xmlns:cx8="http://schemas.microsoft.com/office/drawing/2016/5/14/chartex" xmlns:mc="http://schemas.openxmlformats.org/markup-compatibility/2006" xmlns:aink="http://schemas.microsoft.com/office/drawing/2016/ink" xmlns:am3d="http://schemas.microsoft.com/office/drawing/2017/model3d" xmlns:o="urn:schemas-microsoft-com:office:office" xmlns:oel="http://schemas.microsoft.com/office/2019/extlst" xmlns:r="http://schemas.openxmlformats.org/officeDocument/2006/relationships" xmlns:m="http://schemas.openxmlformats.org/officeDocument/2006/math" xmlns:v="urn:schemas-microsoft-com:vml" xmlns:wp14="http://schemas.microsoft.com/office/word/2010/wordprocessingDrawing" xmlns:wp="http://schemas.openxmlformats.org/drawingml/2006/wordprocessingDrawing" xmlns:w10="urn:schemas-microsoft-com:office:word" xmlns:w="http://schemas.openxmlformats.org/wordprocessingml/2006/main" xmlns:w14="http://schemas.microsoft.com/office/word/2010/wordml" xmlns:w15="http://schemas.microsoft.com/office/word/2012/wordml" xmlns:w16cex="http://schemas.microsoft.com/office/word/2018/wordml/cex" xmlns:w16cid="http://schemas.microsoft.com/office/word/2016/wordml/cid" xmlns:w16="http://schemas.microsoft.com/office/word/2018/wordml" xmlns:w16du="http://schemas.microsoft.com/office/word/2023/wordml/word16du" xmlns:w16sdtdh="http://schemas.microsoft.com/office/word/2020/wordml/sdtdatahash" xmlns:w16sdtfl="http://schemas.microsoft.com/office/word/2024/wordml/sdtformatlock" xmlns:w16se="http://schemas.microsoft.com/office/word/2015/wordml/symex" xmlns:wpg="http://schemas.microsoft.com/office/word/2010/wordprocessingGroup" xmlns:wpi="http://schemas.microsoft.com/office/word/2010/wordprocessingInk" xmlns:wne="http://schemas.microsoft.com/office/word/2006/wordml" xmlns:wps="http://schemas.microsoft.com/office/word/2010/wordprocessingShape" mc:Ignorable="w14 w15 w16se w16cid w16 w16cex w16sdtdh w16sdtfl w16du wp14">
   <w:endnote w:type="separator" w:id="-1">
     <w:p>
       <w:pPr>
@@ -9844,7 +9719,7 @@
 </file>
 
 <file path=word/footer1.xml><?xml version="1.0" encoding="utf-8"?>
-<w:ftr xmlns:wpc="http://schemas.microsoft.com/office/word/2010/wordprocessingCanvas" xmlns:cx="http://schemas.microsoft.com/office/drawing/2014/chartex" xmlns:mc="http://schemas.openxmlformats.org/markup-compatibility/2006" xmlns:o="urn:schemas-microsoft-com:office:office" xmlns:r="http://schemas.openxmlformats.org/officeDocument/2006/relationships" xmlns:m="http://schemas.openxmlformats.org/officeDocument/2006/math" xmlns:v="urn:schemas-microsoft-com:vml" xmlns:wp14="http://schemas.microsoft.com/office/word/2010/wordprocessingDrawing" xmlns:wp="http://schemas.openxmlformats.org/drawingml/2006/wordprocessingDrawing" xmlns:w10="urn:schemas-microsoft-com:office:word" xmlns:w="http://schemas.openxmlformats.org/wordprocessingml/2006/main" xmlns:w14="http://schemas.microsoft.com/office/word/2010/wordml" xmlns:w15="http://schemas.microsoft.com/office/word/2012/wordml" xmlns:w16se="http://schemas.microsoft.com/office/word/2015/wordml/symex" xmlns:wpg="http://schemas.microsoft.com/office/word/2010/wordprocessingGroup" xmlns:wpi="http://schemas.microsoft.com/office/word/2010/wordprocessingInk" xmlns:wne="http://schemas.microsoft.com/office/word/2006/wordml" xmlns:wps="http://schemas.microsoft.com/office/word/2010/wordprocessingShape" mc:Ignorable="w14 w15 w16se wp14">
+<w:ftr xmlns:wpc="http://schemas.microsoft.com/office/word/2010/wordprocessingCanvas" xmlns:cx="http://schemas.microsoft.com/office/drawing/2014/chartex" xmlns:cx1="http://schemas.microsoft.com/office/drawing/2015/9/8/chartex" xmlns:cx2="http://schemas.microsoft.com/office/drawing/2015/10/21/chartex" xmlns:cx3="http://schemas.microsoft.com/office/drawing/2016/5/9/chartex" xmlns:cx4="http://schemas.microsoft.com/office/drawing/2016/5/10/chartex" xmlns:cx5="http://schemas.microsoft.com/office/drawing/2016/5/11/chartex" xmlns:cx6="http://schemas.microsoft.com/office/drawing/2016/5/12/chartex" xmlns:cx7="http://schemas.microsoft.com/office/drawing/2016/5/13/chartex" xmlns:cx8="http://schemas.microsoft.com/office/drawing/2016/5/14/chartex" xmlns:mc="http://schemas.openxmlformats.org/markup-compatibility/2006" xmlns:aink="http://schemas.microsoft.com/office/drawing/2016/ink" xmlns:am3d="http://schemas.microsoft.com/office/drawing/2017/model3d" xmlns:o="urn:schemas-microsoft-com:office:office" xmlns:oel="http://schemas.microsoft.com/office/2019/extlst" xmlns:r="http://schemas.openxmlformats.org/officeDocument/2006/relationships" xmlns:m="http://schemas.openxmlformats.org/officeDocument/2006/math" xmlns:v="urn:schemas-microsoft-com:vml" xmlns:wp14="http://schemas.microsoft.com/office/word/2010/wordprocessingDrawing" xmlns:wp="http://schemas.openxmlformats.org/drawingml/2006/wordprocessingDrawing" xmlns:w10="urn:schemas-microsoft-com:office:word" xmlns:w="http://schemas.openxmlformats.org/wordprocessingml/2006/main" xmlns:w14="http://schemas.microsoft.com/office/word/2010/wordml" xmlns:w15="http://schemas.microsoft.com/office/word/2012/wordml" xmlns:w16cex="http://schemas.microsoft.com/office/word/2018/wordml/cex" xmlns:w16cid="http://schemas.microsoft.com/office/word/2016/wordml/cid" xmlns:w16="http://schemas.microsoft.com/office/word/2018/wordml" xmlns:w16du="http://schemas.microsoft.com/office/word/2023/wordml/word16du" xmlns:w16sdtdh="http://schemas.microsoft.com/office/word/2020/wordml/sdtdatahash" xmlns:w16sdtfl="http://schemas.microsoft.com/office/word/2024/wordml/sdtformatlock" xmlns:w16se="http://schemas.microsoft.com/office/word/2015/wordml/symex" xmlns:wpg="http://schemas.microsoft.com/office/word/2010/wordprocessingGroup" xmlns:wpi="http://schemas.microsoft.com/office/word/2010/wordprocessingInk" xmlns:wne="http://schemas.microsoft.com/office/word/2006/wordml" xmlns:wps="http://schemas.microsoft.com/office/word/2010/wordprocessingShape" mc:Ignorable="w14 w15 w16se w16cid w16 w16cex w16sdtdh w16sdtfl w16du wp14">
   <w:p>
     <w:pPr>
       <w:pStyle w:val="Piedepgina"/>
@@ -9854,9 +9729,9 @@
 </file>
 
 <file path=word/footer2.xml><?xml version="1.0" encoding="utf-8"?>
-<w:ftr xmlns:wpc="http://schemas.microsoft.com/office/word/2010/wordprocessingCanvas" xmlns:cx="http://schemas.microsoft.com/office/drawing/2014/chartex" xmlns:mc="http://schemas.openxmlformats.org/markup-compatibility/2006" xmlns:o="urn:schemas-microsoft-com:office:office" xmlns:r="http://schemas.openxmlformats.org/officeDocument/2006/relationships" xmlns:m="http://schemas.openxmlformats.org/officeDocument/2006/math" xmlns:v="urn:schemas-microsoft-com:vml" xmlns:wp14="http://schemas.microsoft.com/office/word/2010/wordprocessingDrawing" xmlns:wp="http://schemas.openxmlformats.org/drawingml/2006/wordprocessingDrawing" xmlns:w10="urn:schemas-microsoft-com:office:word" xmlns:w="http://schemas.openxmlformats.org/wordprocessingml/2006/main" xmlns:w14="http://schemas.microsoft.com/office/word/2010/wordml" xmlns:w15="http://schemas.microsoft.com/office/word/2012/wordml" xmlns:w16se="http://schemas.microsoft.com/office/word/2015/wordml/symex" xmlns:wpg="http://schemas.microsoft.com/office/word/2010/wordprocessingGroup" xmlns:wpi="http://schemas.microsoft.com/office/word/2010/wordprocessingInk" xmlns:wne="http://schemas.microsoft.com/office/word/2006/wordml" xmlns:wps="http://schemas.microsoft.com/office/word/2010/wordprocessingShape" mc:Ignorable="w14 w15 w16se wp14">
-  <w:bookmarkStart w:id="11" w:name="_37o5xb65948r" w:colFirst="0" w:colLast="0"/>
-  <w:bookmarkEnd w:id="11"/>
+<w:ftr xmlns:wpc="http://schemas.microsoft.com/office/word/2010/wordprocessingCanvas" xmlns:cx="http://schemas.microsoft.com/office/drawing/2014/chartex" xmlns:cx1="http://schemas.microsoft.com/office/drawing/2015/9/8/chartex" xmlns:cx2="http://schemas.microsoft.com/office/drawing/2015/10/21/chartex" xmlns:cx3="http://schemas.microsoft.com/office/drawing/2016/5/9/chartex" xmlns:cx4="http://schemas.microsoft.com/office/drawing/2016/5/10/chartex" xmlns:cx5="http://schemas.microsoft.com/office/drawing/2016/5/11/chartex" xmlns:cx6="http://schemas.microsoft.com/office/drawing/2016/5/12/chartex" xmlns:cx7="http://schemas.microsoft.com/office/drawing/2016/5/13/chartex" xmlns:cx8="http://schemas.microsoft.com/office/drawing/2016/5/14/chartex" xmlns:mc="http://schemas.openxmlformats.org/markup-compatibility/2006" xmlns:aink="http://schemas.microsoft.com/office/drawing/2016/ink" xmlns:am3d="http://schemas.microsoft.com/office/drawing/2017/model3d" xmlns:o="urn:schemas-microsoft-com:office:office" xmlns:oel="http://schemas.microsoft.com/office/2019/extlst" xmlns:r="http://schemas.openxmlformats.org/officeDocument/2006/relationships" xmlns:m="http://schemas.openxmlformats.org/officeDocument/2006/math" xmlns:v="urn:schemas-microsoft-com:vml" xmlns:wp14="http://schemas.microsoft.com/office/word/2010/wordprocessingDrawing" xmlns:wp="http://schemas.openxmlformats.org/drawingml/2006/wordprocessingDrawing" xmlns:w10="urn:schemas-microsoft-com:office:word" xmlns:w="http://schemas.openxmlformats.org/wordprocessingml/2006/main" xmlns:w14="http://schemas.microsoft.com/office/word/2010/wordml" xmlns:w15="http://schemas.microsoft.com/office/word/2012/wordml" xmlns:w16cex="http://schemas.microsoft.com/office/word/2018/wordml/cex" xmlns:w16cid="http://schemas.microsoft.com/office/word/2016/wordml/cid" xmlns:w16="http://schemas.microsoft.com/office/word/2018/wordml" xmlns:w16du="http://schemas.microsoft.com/office/word/2023/wordml/word16du" xmlns:w16sdtdh="http://schemas.microsoft.com/office/word/2020/wordml/sdtdatahash" xmlns:w16sdtfl="http://schemas.microsoft.com/office/word/2024/wordml/sdtformatlock" xmlns:w16se="http://schemas.microsoft.com/office/word/2015/wordml/symex" xmlns:wpg="http://schemas.microsoft.com/office/word/2010/wordprocessingGroup" xmlns:wpi="http://schemas.microsoft.com/office/word/2010/wordprocessingInk" xmlns:wne="http://schemas.microsoft.com/office/word/2006/wordml" xmlns:wps="http://schemas.microsoft.com/office/word/2010/wordprocessingShape" mc:Ignorable="w14 w15 w16se w16cid w16 w16cex w16sdtdh w16sdtfl w16du wp14">
+  <w:bookmarkStart w:id="9" w:name="_37o5xb65948r" w:colFirst="0" w:colLast="0"/>
+  <w:bookmarkEnd w:id="9"/>
   <w:p>
     <w:pPr>
       <w:pStyle w:val="Ttulo4"/>
@@ -9898,7 +9773,7 @@
 </file>
 
 <file path=word/footer3.xml><?xml version="1.0" encoding="utf-8"?>
-<w:ftr xmlns:wpc="http://schemas.microsoft.com/office/word/2010/wordprocessingCanvas" xmlns:cx="http://schemas.microsoft.com/office/drawing/2014/chartex" xmlns:mc="http://schemas.openxmlformats.org/markup-compatibility/2006" xmlns:o="urn:schemas-microsoft-com:office:office" xmlns:r="http://schemas.openxmlformats.org/officeDocument/2006/relationships" xmlns:m="http://schemas.openxmlformats.org/officeDocument/2006/math" xmlns:v="urn:schemas-microsoft-com:vml" xmlns:wp14="http://schemas.microsoft.com/office/word/2010/wordprocessingDrawing" xmlns:wp="http://schemas.openxmlformats.org/drawingml/2006/wordprocessingDrawing" xmlns:w10="urn:schemas-microsoft-com:office:word" xmlns:w="http://schemas.openxmlformats.org/wordprocessingml/2006/main" xmlns:w14="http://schemas.microsoft.com/office/word/2010/wordml" xmlns:w15="http://schemas.microsoft.com/office/word/2012/wordml" xmlns:w16se="http://schemas.microsoft.com/office/word/2015/wordml/symex" xmlns:wpg="http://schemas.microsoft.com/office/word/2010/wordprocessingGroup" xmlns:wpi="http://schemas.microsoft.com/office/word/2010/wordprocessingInk" xmlns:wne="http://schemas.microsoft.com/office/word/2006/wordml" xmlns:wps="http://schemas.microsoft.com/office/word/2010/wordprocessingShape" mc:Ignorable="w14 w15 w16se wp14">
+<w:ftr xmlns:wpc="http://schemas.microsoft.com/office/word/2010/wordprocessingCanvas" xmlns:cx="http://schemas.microsoft.com/office/drawing/2014/chartex" xmlns:cx1="http://schemas.microsoft.com/office/drawing/2015/9/8/chartex" xmlns:cx2="http://schemas.microsoft.com/office/drawing/2015/10/21/chartex" xmlns:cx3="http://schemas.microsoft.com/office/drawing/2016/5/9/chartex" xmlns:cx4="http://schemas.microsoft.com/office/drawing/2016/5/10/chartex" xmlns:cx5="http://schemas.microsoft.com/office/drawing/2016/5/11/chartex" xmlns:cx6="http://schemas.microsoft.com/office/drawing/2016/5/12/chartex" xmlns:cx7="http://schemas.microsoft.com/office/drawing/2016/5/13/chartex" xmlns:cx8="http://schemas.microsoft.com/office/drawing/2016/5/14/chartex" xmlns:mc="http://schemas.openxmlformats.org/markup-compatibility/2006" xmlns:aink="http://schemas.microsoft.com/office/drawing/2016/ink" xmlns:am3d="http://schemas.microsoft.com/office/drawing/2017/model3d" xmlns:o="urn:schemas-microsoft-com:office:office" xmlns:oel="http://schemas.microsoft.com/office/2019/extlst" xmlns:r="http://schemas.openxmlformats.org/officeDocument/2006/relationships" xmlns:m="http://schemas.openxmlformats.org/officeDocument/2006/math" xmlns:v="urn:schemas-microsoft-com:vml" xmlns:wp14="http://schemas.microsoft.com/office/word/2010/wordprocessingDrawing" xmlns:wp="http://schemas.openxmlformats.org/drawingml/2006/wordprocessingDrawing" xmlns:w10="urn:schemas-microsoft-com:office:word" xmlns:w="http://schemas.openxmlformats.org/wordprocessingml/2006/main" xmlns:w14="http://schemas.microsoft.com/office/word/2010/wordml" xmlns:w15="http://schemas.microsoft.com/office/word/2012/wordml" xmlns:w16cex="http://schemas.microsoft.com/office/word/2018/wordml/cex" xmlns:w16cid="http://schemas.microsoft.com/office/word/2016/wordml/cid" xmlns:w16="http://schemas.microsoft.com/office/word/2018/wordml" xmlns:w16du="http://schemas.microsoft.com/office/word/2023/wordml/word16du" xmlns:w16sdtdh="http://schemas.microsoft.com/office/word/2020/wordml/sdtdatahash" xmlns:w16sdtfl="http://schemas.microsoft.com/office/word/2024/wordml/sdtformatlock" xmlns:w16se="http://schemas.microsoft.com/office/word/2015/wordml/symex" xmlns:wpg="http://schemas.microsoft.com/office/word/2010/wordprocessingGroup" xmlns:wpi="http://schemas.microsoft.com/office/word/2010/wordprocessingInk" xmlns:wne="http://schemas.microsoft.com/office/word/2006/wordml" xmlns:wps="http://schemas.microsoft.com/office/word/2010/wordprocessingShape" mc:Ignorable="w14 w15 w16se w16cid w16 w16cex w16sdtdh w16sdtfl w16du wp14">
   <w:p>
     <w:pPr>
       <w:pStyle w:val="Ttulo4"/>
@@ -9910,14 +9785,14 @@
         <w:between w:val="nil"/>
       </w:pBdr>
     </w:pPr>
-    <w:bookmarkStart w:id="12" w:name="_y0ojsicse0ov" w:colFirst="0" w:colLast="0"/>
-    <w:bookmarkEnd w:id="12"/>
+    <w:bookmarkStart w:id="10" w:name="_y0ojsicse0ov" w:colFirst="0" w:colLast="0"/>
+    <w:bookmarkEnd w:id="10"/>
   </w:p>
 </w:ftr>
 </file>
 
 <file path=word/footnotes.xml><?xml version="1.0" encoding="utf-8"?>
-<w:footnotes xmlns:wpc="http://schemas.microsoft.com/office/word/2010/wordprocessingCanvas" xmlns:cx="http://schemas.microsoft.com/office/drawing/2014/chartex" xmlns:mc="http://schemas.openxmlformats.org/markup-compatibility/2006" xmlns:o="urn:schemas-microsoft-com:office:office" xmlns:r="http://schemas.openxmlformats.org/officeDocument/2006/relationships" xmlns:m="http://schemas.openxmlformats.org/officeDocument/2006/math" xmlns:v="urn:schemas-microsoft-com:vml" xmlns:wp14="http://schemas.microsoft.com/office/word/2010/wordprocessingDrawing" xmlns:wp="http://schemas.openxmlformats.org/drawingml/2006/wordprocessingDrawing" xmlns:w10="urn:schemas-microsoft-com:office:word" xmlns:w="http://schemas.openxmlformats.org/wordprocessingml/2006/main" xmlns:w14="http://schemas.microsoft.com/office/word/2010/wordml" xmlns:w15="http://schemas.microsoft.com/office/word/2012/wordml" xmlns:w16se="http://schemas.microsoft.com/office/word/2015/wordml/symex" xmlns:wpg="http://schemas.microsoft.com/office/word/2010/wordprocessingGroup" xmlns:wpi="http://schemas.microsoft.com/office/word/2010/wordprocessingInk" xmlns:wne="http://schemas.microsoft.com/office/word/2006/wordml" xmlns:wps="http://schemas.microsoft.com/office/word/2010/wordprocessingShape" mc:Ignorable="w14 w15 w16se wp14">
+<w:footnotes xmlns:wpc="http://schemas.microsoft.com/office/word/2010/wordprocessingCanvas" xmlns:cx="http://schemas.microsoft.com/office/drawing/2014/chartex" xmlns:cx1="http://schemas.microsoft.com/office/drawing/2015/9/8/chartex" xmlns:cx2="http://schemas.microsoft.com/office/drawing/2015/10/21/chartex" xmlns:cx3="http://schemas.microsoft.com/office/drawing/2016/5/9/chartex" xmlns:cx4="http://schemas.microsoft.com/office/drawing/2016/5/10/chartex" xmlns:cx5="http://schemas.microsoft.com/office/drawing/2016/5/11/chartex" xmlns:cx6="http://schemas.microsoft.com/office/drawing/2016/5/12/chartex" xmlns:cx7="http://schemas.microsoft.com/office/drawing/2016/5/13/chartex" xmlns:cx8="http://schemas.microsoft.com/office/drawing/2016/5/14/chartex" xmlns:mc="http://schemas.openxmlformats.org/markup-compatibility/2006" xmlns:aink="http://schemas.microsoft.com/office/drawing/2016/ink" xmlns:am3d="http://schemas.microsoft.com/office/drawing/2017/model3d" xmlns:o="urn:schemas-microsoft-com:office:office" xmlns:oel="http://schemas.microsoft.com/office/2019/extlst" xmlns:r="http://schemas.openxmlformats.org/officeDocument/2006/relationships" xmlns:m="http://schemas.openxmlformats.org/officeDocument/2006/math" xmlns:v="urn:schemas-microsoft-com:vml" xmlns:wp14="http://schemas.microsoft.com/office/word/2010/wordprocessingDrawing" xmlns:wp="http://schemas.openxmlformats.org/drawingml/2006/wordprocessingDrawing" xmlns:w10="urn:schemas-microsoft-com:office:word" xmlns:w="http://schemas.openxmlformats.org/wordprocessingml/2006/main" xmlns:w14="http://schemas.microsoft.com/office/word/2010/wordml" xmlns:w15="http://schemas.microsoft.com/office/word/2012/wordml" xmlns:w16cex="http://schemas.microsoft.com/office/word/2018/wordml/cex" xmlns:w16cid="http://schemas.microsoft.com/office/word/2016/wordml/cid" xmlns:w16="http://schemas.microsoft.com/office/word/2018/wordml" xmlns:w16du="http://schemas.microsoft.com/office/word/2023/wordml/word16du" xmlns:w16sdtdh="http://schemas.microsoft.com/office/word/2020/wordml/sdtdatahash" xmlns:w16sdtfl="http://schemas.microsoft.com/office/word/2024/wordml/sdtformatlock" xmlns:w16se="http://schemas.microsoft.com/office/word/2015/wordml/symex" xmlns:wpg="http://schemas.microsoft.com/office/word/2010/wordprocessingGroup" xmlns:wpi="http://schemas.microsoft.com/office/word/2010/wordprocessingInk" xmlns:wne="http://schemas.microsoft.com/office/word/2006/wordml" xmlns:wps="http://schemas.microsoft.com/office/word/2010/wordprocessingShape" mc:Ignorable="w14 w15 w16se w16cid w16 w16cex w16sdtdh w16sdtfl w16du wp14">
   <w:footnote w:type="separator" w:id="-1">
     <w:p>
       <w:pPr>
@@ -9942,7 +9817,7 @@
 </file>
 
 <file path=word/header1.xml><?xml version="1.0" encoding="utf-8"?>
-<w:hdr xmlns:wpc="http://schemas.microsoft.com/office/word/2010/wordprocessingCanvas" xmlns:cx="http://schemas.microsoft.com/office/drawing/2014/chartex" xmlns:mc="http://schemas.openxmlformats.org/markup-compatibility/2006" xmlns:o="urn:schemas-microsoft-com:office:office" xmlns:r="http://schemas.openxmlformats.org/officeDocument/2006/relationships" xmlns:m="http://schemas.openxmlformats.org/officeDocument/2006/math" xmlns:v="urn:schemas-microsoft-com:vml" xmlns:wp14="http://schemas.microsoft.com/office/word/2010/wordprocessingDrawing" xmlns:wp="http://schemas.openxmlformats.org/drawingml/2006/wordprocessingDrawing" xmlns:w10="urn:schemas-microsoft-com:office:word" xmlns:w="http://schemas.openxmlformats.org/wordprocessingml/2006/main" xmlns:w14="http://schemas.microsoft.com/office/word/2010/wordml" xmlns:w15="http://schemas.microsoft.com/office/word/2012/wordml" xmlns:w16se="http://schemas.microsoft.com/office/word/2015/wordml/symex" xmlns:wpg="http://schemas.microsoft.com/office/word/2010/wordprocessingGroup" xmlns:wpi="http://schemas.microsoft.com/office/word/2010/wordprocessingInk" xmlns:wne="http://schemas.microsoft.com/office/word/2006/wordml" xmlns:wps="http://schemas.microsoft.com/office/word/2010/wordprocessingShape" mc:Ignorable="w14 w15 w16se wp14">
+<w:hdr xmlns:wpc="http://schemas.microsoft.com/office/word/2010/wordprocessingCanvas" xmlns:cx="http://schemas.microsoft.com/office/drawing/2014/chartex" xmlns:cx1="http://schemas.microsoft.com/office/drawing/2015/9/8/chartex" xmlns:cx2="http://schemas.microsoft.com/office/drawing/2015/10/21/chartex" xmlns:cx3="http://schemas.microsoft.com/office/drawing/2016/5/9/chartex" xmlns:cx4="http://schemas.microsoft.com/office/drawing/2016/5/10/chartex" xmlns:cx5="http://schemas.microsoft.com/office/drawing/2016/5/11/chartex" xmlns:cx6="http://schemas.microsoft.com/office/drawing/2016/5/12/chartex" xmlns:cx7="http://schemas.microsoft.com/office/drawing/2016/5/13/chartex" xmlns:cx8="http://schemas.microsoft.com/office/drawing/2016/5/14/chartex" xmlns:mc="http://schemas.openxmlformats.org/markup-compatibility/2006" xmlns:aink="http://schemas.microsoft.com/office/drawing/2016/ink" xmlns:am3d="http://schemas.microsoft.com/office/drawing/2017/model3d" xmlns:o="urn:schemas-microsoft-com:office:office" xmlns:oel="http://schemas.microsoft.com/office/2019/extlst" xmlns:r="http://schemas.openxmlformats.org/officeDocument/2006/relationships" xmlns:m="http://schemas.openxmlformats.org/officeDocument/2006/math" xmlns:v="urn:schemas-microsoft-com:vml" xmlns:wp14="http://schemas.microsoft.com/office/word/2010/wordprocessingDrawing" xmlns:wp="http://schemas.openxmlformats.org/drawingml/2006/wordprocessingDrawing" xmlns:w10="urn:schemas-microsoft-com:office:word" xmlns:w="http://schemas.openxmlformats.org/wordprocessingml/2006/main" xmlns:w14="http://schemas.microsoft.com/office/word/2010/wordml" xmlns:w15="http://schemas.microsoft.com/office/word/2012/wordml" xmlns:w16cex="http://schemas.microsoft.com/office/word/2018/wordml/cex" xmlns:w16cid="http://schemas.microsoft.com/office/word/2016/wordml/cid" xmlns:w16="http://schemas.microsoft.com/office/word/2018/wordml" xmlns:w16du="http://schemas.microsoft.com/office/word/2023/wordml/word16du" xmlns:w16sdtdh="http://schemas.microsoft.com/office/word/2020/wordml/sdtdatahash" xmlns:w16sdtfl="http://schemas.microsoft.com/office/word/2024/wordml/sdtformatlock" xmlns:w16se="http://schemas.microsoft.com/office/word/2015/wordml/symex" xmlns:wpg="http://schemas.microsoft.com/office/word/2010/wordprocessingGroup" xmlns:wpi="http://schemas.microsoft.com/office/word/2010/wordprocessingInk" xmlns:wne="http://schemas.microsoft.com/office/word/2006/wordml" xmlns:wps="http://schemas.microsoft.com/office/word/2010/wordprocessingShape" mc:Ignorable="w14 w15 w16se w16cid w16 w16cex w16sdtdh w16sdtfl w16du wp14">
   <w:p>
     <w:pPr>
       <w:pStyle w:val="Encabezado"/>
@@ -9971,7 +9846,7 @@
           <v:path o:extrusionok="f" gradientshapeok="t" o:connecttype="rect"/>
           <o:lock v:ext="edit" aspectratio="t"/>
         </v:shapetype>
-        <v:shape id="WordPictureWatermark97664688" o:spid="_x0000_s2059" type="#_x0000_t75" style="position:absolute;margin-left:0;margin-top:0;width:972pt;height:1386pt;z-index:-251657216;mso-position-horizontal:center;mso-position-horizontal-relative:margin;mso-position-vertical:center;mso-position-vertical-relative:margin" o:allowincell="f">
+        <v:shape id="WordPictureWatermark97664688" o:spid="_x0000_s1035" type="#_x0000_t75" style="position:absolute;margin-left:0;margin-top:0;width:972pt;height:1386pt;z-index:-251657216;mso-position-horizontal:center;mso-position-horizontal-relative:margin;mso-position-vertical:center;mso-position-vertical-relative:margin" o:allowincell="f">
           <v:imagedata r:id="rId1" o:title="Fondo_1"/>
           <w10:wrap anchorx="margin" anchory="margin"/>
         </v:shape>
@@ -9982,7 +9857,7 @@
 </file>
 
 <file path=word/header2.xml><?xml version="1.0" encoding="utf-8"?>
-<w:hdr xmlns:wpc="http://schemas.microsoft.com/office/word/2010/wordprocessingCanvas" xmlns:cx="http://schemas.microsoft.com/office/drawing/2014/chartex" xmlns:mc="http://schemas.openxmlformats.org/markup-compatibility/2006" xmlns:o="urn:schemas-microsoft-com:office:office" xmlns:r="http://schemas.openxmlformats.org/officeDocument/2006/relationships" xmlns:m="http://schemas.openxmlformats.org/officeDocument/2006/math" xmlns:v="urn:schemas-microsoft-com:vml" xmlns:wp14="http://schemas.microsoft.com/office/word/2010/wordprocessingDrawing" xmlns:wp="http://schemas.openxmlformats.org/drawingml/2006/wordprocessingDrawing" xmlns:w10="urn:schemas-microsoft-com:office:word" xmlns:w="http://schemas.openxmlformats.org/wordprocessingml/2006/main" xmlns:w14="http://schemas.microsoft.com/office/word/2010/wordml" xmlns:w15="http://schemas.microsoft.com/office/word/2012/wordml" xmlns:w16se="http://schemas.microsoft.com/office/word/2015/wordml/symex" xmlns:wpg="http://schemas.microsoft.com/office/word/2010/wordprocessingGroup" xmlns:wpi="http://schemas.microsoft.com/office/word/2010/wordprocessingInk" xmlns:wne="http://schemas.microsoft.com/office/word/2006/wordml" xmlns:wps="http://schemas.microsoft.com/office/word/2010/wordprocessingShape" mc:Ignorable="w14 w15 w16se wp14">
+<w:hdr xmlns:wpc="http://schemas.microsoft.com/office/word/2010/wordprocessingCanvas" xmlns:cx="http://schemas.microsoft.com/office/drawing/2014/chartex" xmlns:cx1="http://schemas.microsoft.com/office/drawing/2015/9/8/chartex" xmlns:cx2="http://schemas.microsoft.com/office/drawing/2015/10/21/chartex" xmlns:cx3="http://schemas.microsoft.com/office/drawing/2016/5/9/chartex" xmlns:cx4="http://schemas.microsoft.com/office/drawing/2016/5/10/chartex" xmlns:cx5="http://schemas.microsoft.com/office/drawing/2016/5/11/chartex" xmlns:cx6="http://schemas.microsoft.com/office/drawing/2016/5/12/chartex" xmlns:cx7="http://schemas.microsoft.com/office/drawing/2016/5/13/chartex" xmlns:cx8="http://schemas.microsoft.com/office/drawing/2016/5/14/chartex" xmlns:mc="http://schemas.openxmlformats.org/markup-compatibility/2006" xmlns:aink="http://schemas.microsoft.com/office/drawing/2016/ink" xmlns:am3d="http://schemas.microsoft.com/office/drawing/2017/model3d" xmlns:o="urn:schemas-microsoft-com:office:office" xmlns:oel="http://schemas.microsoft.com/office/2019/extlst" xmlns:r="http://schemas.openxmlformats.org/officeDocument/2006/relationships" xmlns:m="http://schemas.openxmlformats.org/officeDocument/2006/math" xmlns:v="urn:schemas-microsoft-com:vml" xmlns:wp14="http://schemas.microsoft.com/office/word/2010/wordprocessingDrawing" xmlns:wp="http://schemas.openxmlformats.org/drawingml/2006/wordprocessingDrawing" xmlns:w10="urn:schemas-microsoft-com:office:word" xmlns:w="http://schemas.openxmlformats.org/wordprocessingml/2006/main" xmlns:w14="http://schemas.microsoft.com/office/word/2010/wordml" xmlns:w15="http://schemas.microsoft.com/office/word/2012/wordml" xmlns:w16cex="http://schemas.microsoft.com/office/word/2018/wordml/cex" xmlns:w16cid="http://schemas.microsoft.com/office/word/2016/wordml/cid" xmlns:w16="http://schemas.microsoft.com/office/word/2018/wordml" xmlns:w16du="http://schemas.microsoft.com/office/word/2023/wordml/word16du" xmlns:w16sdtdh="http://schemas.microsoft.com/office/word/2020/wordml/sdtdatahash" xmlns:w16sdtfl="http://schemas.microsoft.com/office/word/2024/wordml/sdtformatlock" xmlns:w16se="http://schemas.microsoft.com/office/word/2015/wordml/symex" xmlns:wpg="http://schemas.microsoft.com/office/word/2010/wordprocessingGroup" xmlns:wpi="http://schemas.microsoft.com/office/word/2010/wordprocessingInk" xmlns:wne="http://schemas.microsoft.com/office/word/2006/wordml" xmlns:wps="http://schemas.microsoft.com/office/word/2010/wordprocessingShape" mc:Ignorable="w14 w15 w16se w16cid w16 w16cex w16sdtdh w16sdtfl w16du wp14">
   <w:p>
     <w:pPr>
       <w:pStyle w:val="Encabezado"/>
@@ -10011,7 +9886,7 @@
           <v:path o:extrusionok="f" gradientshapeok="t" o:connecttype="rect"/>
           <o:lock v:ext="edit" aspectratio="t"/>
         </v:shapetype>
-        <v:shape id="WordPictureWatermark97664689" o:spid="_x0000_s2060" type="#_x0000_t75" style="position:absolute;margin-left:0;margin-top:0;width:972pt;height:1386pt;z-index:-251656192;mso-position-horizontal:center;mso-position-horizontal-relative:margin;mso-position-vertical:center;mso-position-vertical-relative:margin" o:allowincell="f">
+        <v:shape id="WordPictureWatermark97664689" o:spid="_x0000_s1036" type="#_x0000_t75" style="position:absolute;margin-left:0;margin-top:0;width:972pt;height:1386pt;z-index:-251656192;mso-position-horizontal:center;mso-position-horizontal-relative:margin;mso-position-vertical:center;mso-position-vertical-relative:margin" o:allowincell="f">
           <v:imagedata r:id="rId1" o:title="Fondo_1"/>
           <w10:wrap anchorx="margin" anchory="margin"/>
         </v:shape>
@@ -10022,7 +9897,7 @@
 </file>
 
 <file path=word/header3.xml><?xml version="1.0" encoding="utf-8"?>
-<w:hdr xmlns:wpc="http://schemas.microsoft.com/office/word/2010/wordprocessingCanvas" xmlns:cx="http://schemas.microsoft.com/office/drawing/2014/chartex" xmlns:mc="http://schemas.openxmlformats.org/markup-compatibility/2006" xmlns:o="urn:schemas-microsoft-com:office:office" xmlns:r="http://schemas.openxmlformats.org/officeDocument/2006/relationships" xmlns:m="http://schemas.openxmlformats.org/officeDocument/2006/math" xmlns:v="urn:schemas-microsoft-com:vml" xmlns:wp14="http://schemas.microsoft.com/office/word/2010/wordprocessingDrawing" xmlns:wp="http://schemas.openxmlformats.org/drawingml/2006/wordprocessingDrawing" xmlns:w10="urn:schemas-microsoft-com:office:word" xmlns:w="http://schemas.openxmlformats.org/wordprocessingml/2006/main" xmlns:w14="http://schemas.microsoft.com/office/word/2010/wordml" xmlns:w15="http://schemas.microsoft.com/office/word/2012/wordml" xmlns:w16se="http://schemas.microsoft.com/office/word/2015/wordml/symex" xmlns:wpg="http://schemas.microsoft.com/office/word/2010/wordprocessingGroup" xmlns:wpi="http://schemas.microsoft.com/office/word/2010/wordprocessingInk" xmlns:wne="http://schemas.microsoft.com/office/word/2006/wordml" xmlns:wps="http://schemas.microsoft.com/office/word/2010/wordprocessingShape" mc:Ignorable="w14 w15 w16se wp14">
+<w:hdr xmlns:wpc="http://schemas.microsoft.com/office/word/2010/wordprocessingCanvas" xmlns:cx="http://schemas.microsoft.com/office/drawing/2014/chartex" xmlns:cx1="http://schemas.microsoft.com/office/drawing/2015/9/8/chartex" xmlns:cx2="http://schemas.microsoft.com/office/drawing/2015/10/21/chartex" xmlns:cx3="http://schemas.microsoft.com/office/drawing/2016/5/9/chartex" xmlns:cx4="http://schemas.microsoft.com/office/drawing/2016/5/10/chartex" xmlns:cx5="http://schemas.microsoft.com/office/drawing/2016/5/11/chartex" xmlns:cx6="http://schemas.microsoft.com/office/drawing/2016/5/12/chartex" xmlns:cx7="http://schemas.microsoft.com/office/drawing/2016/5/13/chartex" xmlns:cx8="http://schemas.microsoft.com/office/drawing/2016/5/14/chartex" xmlns:mc="http://schemas.openxmlformats.org/markup-compatibility/2006" xmlns:aink="http://schemas.microsoft.com/office/drawing/2016/ink" xmlns:am3d="http://schemas.microsoft.com/office/drawing/2017/model3d" xmlns:o="urn:schemas-microsoft-com:office:office" xmlns:oel="http://schemas.microsoft.com/office/2019/extlst" xmlns:r="http://schemas.openxmlformats.org/officeDocument/2006/relationships" xmlns:m="http://schemas.openxmlformats.org/officeDocument/2006/math" xmlns:v="urn:schemas-microsoft-com:vml" xmlns:wp14="http://schemas.microsoft.com/office/word/2010/wordprocessingDrawing" xmlns:wp="http://schemas.openxmlformats.org/drawingml/2006/wordprocessingDrawing" xmlns:w10="urn:schemas-microsoft-com:office:word" xmlns:w="http://schemas.openxmlformats.org/wordprocessingml/2006/main" xmlns:w14="http://schemas.microsoft.com/office/word/2010/wordml" xmlns:w15="http://schemas.microsoft.com/office/word/2012/wordml" xmlns:w16cex="http://schemas.microsoft.com/office/word/2018/wordml/cex" xmlns:w16cid="http://schemas.microsoft.com/office/word/2016/wordml/cid" xmlns:w16="http://schemas.microsoft.com/office/word/2018/wordml" xmlns:w16du="http://schemas.microsoft.com/office/word/2023/wordml/word16du" xmlns:w16sdtdh="http://schemas.microsoft.com/office/word/2020/wordml/sdtdatahash" xmlns:w16sdtfl="http://schemas.microsoft.com/office/word/2024/wordml/sdtformatlock" xmlns:w16se="http://schemas.microsoft.com/office/word/2015/wordml/symex" xmlns:wpg="http://schemas.microsoft.com/office/word/2010/wordprocessingGroup" xmlns:wpi="http://schemas.microsoft.com/office/word/2010/wordprocessingInk" xmlns:wne="http://schemas.microsoft.com/office/word/2006/wordml" xmlns:wps="http://schemas.microsoft.com/office/word/2010/wordprocessingShape" mc:Ignorable="w14 w15 w16se w16cid w16 w16cex w16sdtdh w16sdtfl w16du wp14">
   <w:p>
     <w:pPr>
       <w:pStyle w:val="Encabezado"/>
@@ -10051,7 +9926,7 @@
           <v:path o:extrusionok="f" gradientshapeok="t" o:connecttype="rect"/>
           <o:lock v:ext="edit" aspectratio="t"/>
         </v:shapetype>
-        <v:shape id="WordPictureWatermark97664687" o:spid="_x0000_s2058" type="#_x0000_t75" style="position:absolute;margin-left:0;margin-top:0;width:972pt;height:1386pt;z-index:-251658240;mso-position-horizontal:center;mso-position-horizontal-relative:margin;mso-position-vertical:center;mso-position-vertical-relative:margin" o:allowincell="f">
+        <v:shape id="WordPictureWatermark97664687" o:spid="_x0000_s1034" type="#_x0000_t75" style="position:absolute;margin-left:0;margin-top:0;width:972pt;height:1386pt;z-index:-251658240;mso-position-horizontal:center;mso-position-horizontal-relative:margin;mso-position-vertical:center;mso-position-vertical-relative:margin" o:allowincell="f">
           <v:imagedata r:id="rId1" o:title="Fondo_1"/>
           <w10:wrap anchorx="margin" anchory="margin"/>
         </v:shape>
@@ -10062,7 +9937,7 @@
 </file>
 
 <file path=word/numbering.xml><?xml version="1.0" encoding="utf-8"?>
-<w:numbering xmlns:wpc="http://schemas.microsoft.com/office/word/2010/wordprocessingCanvas" xmlns:cx="http://schemas.microsoft.com/office/drawing/2014/chartex" xmlns:mc="http://schemas.openxmlformats.org/markup-compatibility/2006" xmlns:o="urn:schemas-microsoft-com:office:office" xmlns:r="http://schemas.openxmlformats.org/officeDocument/2006/relationships" xmlns:m="http://schemas.openxmlformats.org/officeDocument/2006/math" xmlns:v="urn:schemas-microsoft-com:vml" xmlns:wp14="http://schemas.microsoft.com/office/word/2010/wordprocessingDrawing" xmlns:wp="http://schemas.openxmlformats.org/drawingml/2006/wordprocessingDrawing" xmlns:w10="urn:schemas-microsoft-com:office:word" xmlns:w="http://schemas.openxmlformats.org/wordprocessingml/2006/main" xmlns:w14="http://schemas.microsoft.com/office/word/2010/wordml" xmlns:w15="http://schemas.microsoft.com/office/word/2012/wordml" xmlns:w16se="http://schemas.microsoft.com/office/word/2015/wordml/symex" xmlns:wpg="http://schemas.microsoft.com/office/word/2010/wordprocessingGroup" xmlns:wpi="http://schemas.microsoft.com/office/word/2010/wordprocessingInk" xmlns:wne="http://schemas.microsoft.com/office/word/2006/wordml" xmlns:wps="http://schemas.microsoft.com/office/word/2010/wordprocessingShape" mc:Ignorable="w14 w15 w16se wp14">
+<w:numbering xmlns:wpc="http://schemas.microsoft.com/office/word/2010/wordprocessingCanvas" xmlns:cx="http://schemas.microsoft.com/office/drawing/2014/chartex" xmlns:cx1="http://schemas.microsoft.com/office/drawing/2015/9/8/chartex" xmlns:cx2="http://schemas.microsoft.com/office/drawing/2015/10/21/chartex" xmlns:cx3="http://schemas.microsoft.com/office/drawing/2016/5/9/chartex" xmlns:cx4="http://schemas.microsoft.com/office/drawing/2016/5/10/chartex" xmlns:cx5="http://schemas.microsoft.com/office/drawing/2016/5/11/chartex" xmlns:cx6="http://schemas.microsoft.com/office/drawing/2016/5/12/chartex" xmlns:cx7="http://schemas.microsoft.com/office/drawing/2016/5/13/chartex" xmlns:cx8="http://schemas.microsoft.com/office/drawing/2016/5/14/chartex" xmlns:mc="http://schemas.openxmlformats.org/markup-compatibility/2006" xmlns:aink="http://schemas.microsoft.com/office/drawing/2016/ink" xmlns:am3d="http://schemas.microsoft.com/office/drawing/2017/model3d" xmlns:o="urn:schemas-microsoft-com:office:office" xmlns:oel="http://schemas.microsoft.com/office/2019/extlst" xmlns:r="http://schemas.openxmlformats.org/officeDocument/2006/relationships" xmlns:m="http://schemas.openxmlformats.org/officeDocument/2006/math" xmlns:v="urn:schemas-microsoft-com:vml" xmlns:wp14="http://schemas.microsoft.com/office/word/2010/wordprocessingDrawing" xmlns:wp="http://schemas.openxmlformats.org/drawingml/2006/wordprocessingDrawing" xmlns:w10="urn:schemas-microsoft-com:office:word" xmlns:w="http://schemas.openxmlformats.org/wordprocessingml/2006/main" xmlns:w14="http://schemas.microsoft.com/office/word/2010/wordml" xmlns:w15="http://schemas.microsoft.com/office/word/2012/wordml" xmlns:w16cex="http://schemas.microsoft.com/office/word/2018/wordml/cex" xmlns:w16cid="http://schemas.microsoft.com/office/word/2016/wordml/cid" xmlns:w16="http://schemas.microsoft.com/office/word/2018/wordml" xmlns:w16du="http://schemas.microsoft.com/office/word/2023/wordml/word16du" xmlns:w16sdtdh="http://schemas.microsoft.com/office/word/2020/wordml/sdtdatahash" xmlns:w16sdtfl="http://schemas.microsoft.com/office/word/2024/wordml/sdtformatlock" xmlns:w16se="http://schemas.microsoft.com/office/word/2015/wordml/symex" xmlns:wpg="http://schemas.microsoft.com/office/word/2010/wordprocessingGroup" xmlns:wpi="http://schemas.microsoft.com/office/word/2010/wordprocessingInk" xmlns:wne="http://schemas.microsoft.com/office/word/2006/wordml" xmlns:wps="http://schemas.microsoft.com/office/word/2010/wordprocessingShape" mc:Ignorable="w14 w15 w16se w16cid w16 w16cex w16sdtdh w16sdtfl w16du wp14">
   <w:abstractNum w:abstractNumId="0" w15:restartNumberingAfterBreak="0">
     <w:nsid w:val="046F4AF5"/>
     <w:multiLevelType w:val="multilevel"/>
@@ -10628,26 +10503,26 @@
       </w:rPr>
     </w:lvl>
   </w:abstractNum>
-  <w:num w:numId="1">
+  <w:num w:numId="1" w16cid:durableId="2069915336">
     <w:abstractNumId w:val="0"/>
   </w:num>
-  <w:num w:numId="2">
+  <w:num w:numId="2" w16cid:durableId="1858273927">
     <w:abstractNumId w:val="2"/>
   </w:num>
-  <w:num w:numId="3">
+  <w:num w:numId="3" w16cid:durableId="840007503">
     <w:abstractNumId w:val="1"/>
   </w:num>
-  <w:num w:numId="4">
+  <w:num w:numId="4" w16cid:durableId="1376739476">
     <w:abstractNumId w:val="3"/>
   </w:num>
-  <w:num w:numId="5">
+  <w:num w:numId="5" w16cid:durableId="277761225">
     <w:abstractNumId w:val="4"/>
   </w:num>
 </w:numbering>
 </file>
 
 <file path=word/styles.xml><?xml version="1.0" encoding="utf-8"?>
-<w:styles xmlns:mc="http://schemas.openxmlformats.org/markup-compatibility/2006" xmlns:r="http://schemas.openxmlformats.org/officeDocument/2006/relationships" xmlns:w="http://schemas.openxmlformats.org/wordprocessingml/2006/main" xmlns:w14="http://schemas.microsoft.com/office/word/2010/wordml" xmlns:w15="http://schemas.microsoft.com/office/word/2012/wordml" xmlns:w16se="http://schemas.microsoft.com/office/word/2015/wordml/symex" mc:Ignorable="w14 w15 w16se">
+<w:styles xmlns:mc="http://schemas.openxmlformats.org/markup-compatibility/2006" xmlns:r="http://schemas.openxmlformats.org/officeDocument/2006/relationships" xmlns:w="http://schemas.openxmlformats.org/wordprocessingml/2006/main" xmlns:w14="http://schemas.microsoft.com/office/word/2010/wordml" xmlns:w15="http://schemas.microsoft.com/office/word/2012/wordml" xmlns:w16cex="http://schemas.microsoft.com/office/word/2018/wordml/cex" xmlns:w16cid="http://schemas.microsoft.com/office/word/2016/wordml/cid" xmlns:w16="http://schemas.microsoft.com/office/word/2018/wordml" xmlns:w16du="http://schemas.microsoft.com/office/word/2023/wordml/word16du" xmlns:w16sdtdh="http://schemas.microsoft.com/office/word/2020/wordml/sdtdatahash" xmlns:w16sdtfl="http://schemas.microsoft.com/office/word/2024/wordml/sdtformatlock" xmlns:w16se="http://schemas.microsoft.com/office/word/2015/wordml/symex" mc:Ignorable="w14 w15 w16se w16cid w16 w16cex w16sdtdh w16sdtfl w16du">
   <w:docDefaults>
     <w:rPrDefault>
       <w:rPr>
@@ -10665,7 +10540,7 @@
       </w:pPr>
     </w:pPrDefault>
   </w:docDefaults>
-  <w:latentStyles w:defLockedState="0" w:defUIPriority="99" w:defSemiHidden="0" w:defUnhideWhenUsed="0" w:defQFormat="0" w:count="371">
+  <w:latentStyles w:defLockedState="0" w:defUIPriority="99" w:defSemiHidden="0" w:defUnhideWhenUsed="0" w:defQFormat="0" w:count="376">
     <w:lsdException w:name="Normal" w:uiPriority="0" w:qFormat="1"/>
     <w:lsdException w:name="heading 1" w:uiPriority="9" w:qFormat="1"/>
     <w:lsdException w:name="heading 2" w:semiHidden="1" w:uiPriority="9" w:unhideWhenUsed="1" w:qFormat="1"/>
@@ -11037,6 +10912,11 @@
     <w:lsdException w:name="List Table 5 Dark Accent 6" w:uiPriority="50"/>
     <w:lsdException w:name="List Table 6 Colorful Accent 6" w:uiPriority="51"/>
     <w:lsdException w:name="List Table 7 Colorful Accent 6" w:uiPriority="52"/>
+    <w:lsdException w:name="Mention" w:semiHidden="1" w:unhideWhenUsed="1"/>
+    <w:lsdException w:name="Smart Hyperlink" w:semiHidden="1" w:unhideWhenUsed="1"/>
+    <w:lsdException w:name="Hashtag" w:semiHidden="1" w:unhideWhenUsed="1"/>
+    <w:lsdException w:name="Unresolved Mention" w:semiHidden="1" w:unhideWhenUsed="1"/>
+    <w:lsdException w:name="Smart Link" w:semiHidden="1" w:unhideWhenUsed="1"/>
   </w:latentStyles>
   <w:style w:type="paragraph" w:default="1" w:styleId="Normal">
     <w:name w:val="Normal"/>
@@ -11328,7 +11208,7 @@
       <w:lang w:val="en-US" w:eastAsia="en-US"/>
     </w:rPr>
   </w:style>
-  <w:style w:type="character" w:styleId="Textoennegrita">
+  <w:style w:type="character" w:styleId="Fuerte">
     <w:name w:val="Strong"/>
     <w:basedOn w:val="Fuentedeprrafopredeter"/>
     <w:uiPriority w:val="22"/>
@@ -11388,7 +11268,7 @@
       </w:tblBorders>
     </w:tblPr>
   </w:style>
-  <w:style w:type="table" w:styleId="Tabladecuadrcula4-nfasis1">
+  <w:style w:type="table" w:styleId="Tablaconcuadrcula4-nfasis1">
     <w:name w:val="Grid Table 4 Accent 1"/>
     <w:basedOn w:val="Tablanormal"/>
     <w:uiPriority w:val="49"/>
@@ -11464,7 +11344,7 @@
       </w:tcPr>
     </w:tblStylePr>
   </w:style>
-  <w:style w:type="table" w:styleId="Tabladecuadrcula4-nfasis5">
+  <w:style w:type="table" w:styleId="Tablaconcuadrcula4-nfasis5">
     <w:name w:val="Grid Table 4 Accent 5"/>
     <w:basedOn w:val="Tablanormal"/>
     <w:uiPriority w:val="49"/>

</xml_diff>